<commit_message>
Dashboard Display Result Revision
</commit_message>
<xml_diff>
--- a/Creative Paradise ERP ကို စမ်းသပ် ခြင်း.docx
+++ b/Creative Paradise ERP ကို စမ်းသပ် ခြင်း.docx
@@ -169,14 +169,18 @@
                 <w:rFonts w:asciiTheme="minorBidi" w:hAnsiTheme="minorBidi"/>
               </w:rPr>
             </w:pPr>
-            <w:proofErr w:type="spellStart"/>
             <w:r>
               <w:rPr>
                 <w:rFonts w:asciiTheme="minorBidi" w:hAnsiTheme="minorBidi"/>
               </w:rPr>
-              <w:t>finance_user</w:t>
+              <w:t>finance</w:t>
             </w:r>
-            <w:proofErr w:type="spellEnd"/>
+            <w:r>
+              <w:rPr>
+                <w:rFonts w:asciiTheme="minorBidi" w:hAnsiTheme="minorBidi"/>
+              </w:rPr>
+              <w:t>1, finance2</w:t>
+            </w:r>
           </w:p>
           <w:p>
             <w:pPr>
@@ -191,6 +195,19 @@
                 <w:rFonts w:asciiTheme="minorBidi" w:hAnsiTheme="minorBidi"/>
               </w:rPr>
               <w:t>buyer1</w:t>
+            </w:r>
+            <w:r>
+              <w:rPr>
+                <w:rFonts w:asciiTheme="minorBidi" w:hAnsiTheme="minorBidi" w:hint="cs"/>
+                <w:cs/>
+              </w:rPr>
+              <w:t xml:space="preserve">, </w:t>
+            </w:r>
+            <w:r>
+              <w:rPr>
+                <w:rFonts w:asciiTheme="minorBidi" w:hAnsiTheme="minorBidi"/>
+              </w:rPr>
+              <w:t>buyer2</w:t>
             </w:r>
           </w:p>
           <w:p>
@@ -207,6 +224,12 @@
               </w:rPr>
               <w:t>site_eng1</w:t>
             </w:r>
+            <w:r>
+              <w:rPr>
+                <w:rFonts w:asciiTheme="minorBidi" w:hAnsiTheme="minorBidi"/>
+              </w:rPr>
+              <w:t>, site_eng2</w:t>
+            </w:r>
           </w:p>
           <w:p>
             <w:pPr>
@@ -221,6 +244,12 @@
                 <w:rFonts w:asciiTheme="minorBidi" w:hAnsiTheme="minorBidi"/>
               </w:rPr>
               <w:t>store1</w:t>
+            </w:r>
+            <w:r>
+              <w:rPr>
+                <w:rFonts w:asciiTheme="minorBidi" w:hAnsiTheme="minorBidi"/>
+              </w:rPr>
+              <w:t>, store2</w:t>
             </w:r>
           </w:p>
         </w:tc>
@@ -2701,19 +2730,8 @@
           <w:szCs w:val="22"/>
           <w:cs/>
         </w:rPr>
-        <w:t xml:space="preserve">သွင်းခဲ့တဲ့ နာမည်အတိုင်း </w:t>
-      </w:r>
-      <w:proofErr w:type="gramStart"/>
-      <w:r>
-        <w:rPr>
-          <w:rFonts w:cs="Myanmar Text"/>
-          <w:sz w:val="22"/>
-          <w:szCs w:val="22"/>
-          <w:cs/>
-        </w:rPr>
-        <w:t>သေချာရိုက်ပါ)။</w:t>
-      </w:r>
-      <w:proofErr w:type="gramEnd"/>
+        <w:t>သွင်းခဲ့တဲ့ နာမည်အတိုင်း သေချာရိုက်ပါ)။</w:t>
+      </w:r>
       <w:r>
         <w:rPr>
           <w:sz w:val="22"/>
@@ -2780,19 +2798,8 @@
           <w:szCs w:val="22"/>
           <w:cs/>
         </w:rPr>
-        <w:t xml:space="preserve">လက်ကျန် ၁၀၀ ထက် </w:t>
-      </w:r>
-      <w:proofErr w:type="gramStart"/>
-      <w:r>
-        <w:rPr>
-          <w:rFonts w:cs="Myanmar Text"/>
-          <w:sz w:val="22"/>
-          <w:szCs w:val="22"/>
-          <w:cs/>
-        </w:rPr>
-        <w:t>မများပါစေနဲ့)။</w:t>
-      </w:r>
-      <w:proofErr w:type="gramEnd"/>
+        <w:t>လက်ကျန် ၁၀၀ ထက် မများပါစေနဲ့)။</w:t>
+      </w:r>
       <w:r>
         <w:rPr>
           <w:sz w:val="22"/>
@@ -2859,19 +2866,8 @@
           <w:szCs w:val="22"/>
           <w:cs/>
         </w:rPr>
-        <w:t xml:space="preserve">ဆိုက်စရိတ် </w:t>
-      </w:r>
-      <w:proofErr w:type="gramStart"/>
-      <w:r>
-        <w:rPr>
-          <w:rFonts w:cs="Myanmar Text"/>
-          <w:sz w:val="22"/>
-          <w:szCs w:val="22"/>
-          <w:cs/>
-        </w:rPr>
-        <w:t>တွက်ဖို့အတွက်ပါ)။</w:t>
-      </w:r>
-      <w:proofErr w:type="gramEnd"/>
+        <w:t>ဆိုက်စရိတ် တွက်ဖို့အတွက်ပါ)။</w:t>
+      </w:r>
       <w:r>
         <w:rPr>
           <w:sz w:val="22"/>

</xml_diff>